<commit_message>
docs(review): research paper summary condensed to two pages
Page one is the summary of Zhang et al. 2024: problem, objectives, design with
the specification table set two-up, locomotion, results and conclusion. Page
two is the comparison against our project, with the table and the two
discussion points.

Split on a page break so each page is one complete thing, rather than letting
section 7 straddle the boundary.
</commit_message>
<xml_diff>
--- a/docs/review/Research_Paper_Summary.docx
+++ b/docs/review/Research_Paper_Summary.docx
@@ -2,6 +2,20 @@
 <file path=word/document.xml><?xml version="1.0" encoding="utf-8"?>
 <w:document xmlns:wpc="http://schemas.microsoft.com/office/word/2010/wordprocessingCanvas" xmlns:mo="http://schemas.microsoft.com/office/mac/office/2008/main" xmlns:mc="http://schemas.openxmlformats.org/markup-compatibility/2006" xmlns:mv="urn:schemas-microsoft-com:mac:vml" xmlns:o="urn:schemas-microsoft-com:office:office" xmlns:r="http://schemas.openxmlformats.org/officeDocument/2006/relationships" xmlns:m="http://schemas.openxmlformats.org/officeDocument/2006/math" xmlns:v="urn:schemas-microsoft-com:vml" xmlns:wp14="http://schemas.microsoft.com/office/word/2010/wordprocessingDrawing" xmlns:wp="http://schemas.openxmlformats.org/drawingml/2006/wordprocessingDrawing" xmlns:w10="urn:schemas-microsoft-com:office:word" xmlns:w="http://schemas.openxmlformats.org/wordprocessingml/2006/main" xmlns:w14="http://schemas.microsoft.com/office/word/2010/wordml" xmlns:wpg="http://schemas.microsoft.com/office/word/2010/wordprocessingGroup" xmlns:wpi="http://schemas.microsoft.com/office/word/2010/wordprocessingInk" xmlns:wne="http://schemas.microsoft.com/office/word/2006/wordml" xmlns:wps="http://schemas.microsoft.com/office/word/2010/wordprocessingShape" mc:Ignorable="w14 wp14">
   <w:body>
+    <w:p>
+      <w:pPr>
+        <w:spacing w:after="40"/>
+        <w:jc w:val="center"/>
+      </w:pPr>
+      <w:r>
+        <w:rPr>
+          <w:b/>
+          <w:i w:val="0"/>
+          <w:sz w:val="30"/>
+        </w:rPr>
+        <w:t>Research Paper Summary</w:t>
+      </w:r>
+    </w:p>
     <w:p>
       <w:pPr>
         <w:spacing w:after="80"/>
@@ -11,28 +25,14 @@
         <w:rPr>
           <w:b/>
           <w:i w:val="0"/>
-          <w:sz w:val="40"/>
-        </w:rPr>
-        <w:t>Research Paper Summary</w:t>
-      </w:r>
-    </w:p>
-    <w:p>
-      <w:pPr>
-        <w:spacing w:after="200"/>
-        <w:jc w:val="center"/>
-      </w:pPr>
-      <w:r>
-        <w:rPr>
-          <w:b/>
-          <w:i w:val="0"/>
-          <w:sz w:val="27"/>
+          <w:sz w:val="22"/>
         </w:rPr>
         <w:t>Development of a Bionic Hexapod Robot with Adaptive Gait and Clearance for Enhanced Agricultural Field Scouting</w:t>
       </w:r>
     </w:p>
     <w:p>
       <w:pPr>
-        <w:spacing w:after="60"/>
+        <w:spacing w:after="40"/>
         <w:jc w:val="center"/>
       </w:pPr>
       <w:r>
@@ -40,29 +40,14 @@
           <w:b w:val="0"/>
           <w:i w:val="0"/>
           <w:color w:val="555555"/>
-          <w:sz w:val="22"/>
+          <w:sz w:val="18"/>
         </w:rPr>
-        <w:t>Zhenghua Zhang, Weilong He, Fan Wu, Lina Quesada, Lirong Xiang</w:t>
+        <w:t>Zhenghua Zhang, Weilong He, Fan Wu, Lina Quesada, Lirong Xiang  ·  Frontiers in Robotics and AI, 2024, 11:1426269</w:t>
       </w:r>
     </w:p>
     <w:p>
       <w:pPr>
-        <w:spacing w:after="60"/>
-        <w:jc w:val="center"/>
-      </w:pPr>
-      <w:r>
-        <w:rPr>
-          <w:b w:val="0"/>
-          <w:i w:val="0"/>
-          <w:color w:val="555555"/>
-          <w:sz w:val="22"/>
-        </w:rPr>
-        <w:t>Frontiers in Robotics and AI, 2024, 11:1426269</w:t>
-      </w:r>
-    </w:p>
-    <w:p>
-      <w:pPr>
-        <w:spacing w:after="280"/>
+        <w:spacing w:after="160"/>
         <w:jc w:val="center"/>
       </w:pPr>
       <w:r>
@@ -70,7 +55,7 @@
           <w:b w:val="0"/>
           <w:i/>
           <w:color w:val="555555"/>
-          <w:sz w:val="22"/>
+          <w:sz w:val="18"/>
         </w:rPr>
         <w:t>Application: agricultural field scouting and autonomous navigation</w:t>
       </w:r>
@@ -85,15 +70,15 @@
     </w:p>
     <w:p>
       <w:pPr>
-        <w:spacing w:after="140"/>
+        <w:spacing w:after="80"/>
       </w:pPr>
       <w:r>
         <w:rPr>
           <w:b w:val="0"/>
           <w:i w:val="0"/>
-          <w:sz w:val="22"/>
+          <w:sz w:val="20"/>
         </w:rPr>
-        <w:t>Traditional agricultural robots such as wheeled vehicles and drones have limitations in uneven, obstructed and unstructured agricultural environments. Wheeled robots can damage soil and plants and have poor terrain adaptability, while drones have limited ground-level sensing and are affected by wind and obstacles. The researchers therefore developed a six-legged robot capable of stable movement over complex terrain.</w:t>
+        <w:t>Traditional agricultural robots such as wheeled vehicles and drones have limitations in uneven, obstructed and unstructured agricultural environments. Wheeled robots can damage soil and plants and adapt poorly to terrain, while drones have limited ground-level sensing and are affected by wind and obstacles. The researchers therefore developed a six-legged robot capable of stable movement over complex terrain.</w:t>
       </w:r>
     </w:p>
     <w:p>
@@ -101,74 +86,79 @@
         <w:pStyle w:val="Heading1"/>
       </w:pPr>
       <w:r>
-        <w:t>2.  Objective</w:t>
-      </w:r>
-    </w:p>
-    <w:p>
-      <w:pPr>
-        <w:spacing w:after="140"/>
-      </w:pPr>
-      <w:r>
-        <w:rPr>
-          <w:b w:val="0"/>
-          <w:i w:val="0"/>
-          <w:sz w:val="22"/>
-        </w:rPr>
-        <w:t>The main objectives were to:</w:t>
+        <w:t>2.  Objectives</w:t>
       </w:r>
     </w:p>
     <w:p>
       <w:pPr>
         <w:pStyle w:val="ListBullet"/>
-        <w:spacing w:after="60"/>
+        <w:spacing w:after="20" w:line="240" w:lineRule="auto"/>
       </w:pPr>
       <w:r>
+        <w:rPr>
+          <w:sz w:val="20"/>
+        </w:rPr>
         <w:t>Develop a lightweight and flexible bionic hexapod robot.</w:t>
       </w:r>
     </w:p>
     <w:p>
       <w:pPr>
         <w:pStyle w:val="ListBullet"/>
-        <w:spacing w:after="60"/>
+        <w:spacing w:after="20" w:line="240" w:lineRule="auto"/>
       </w:pPr>
       <w:r>
+        <w:rPr>
+          <w:sz w:val="20"/>
+        </w:rPr>
         <w:t>Enable movement over different terrains and slopes.</w:t>
       </w:r>
     </w:p>
     <w:p>
       <w:pPr>
         <w:pStyle w:val="ListBullet"/>
-        <w:spacing w:after="60"/>
+        <w:spacing w:after="20" w:line="240" w:lineRule="auto"/>
       </w:pPr>
       <w:r>
+        <w:rPr>
+          <w:sz w:val="20"/>
+        </w:rPr>
         <w:t>Develop terrain-adaptive gait and adjustable ground clearance.</w:t>
       </w:r>
     </w:p>
     <w:p>
       <w:pPr>
         <w:pStyle w:val="ListBullet"/>
-        <w:spacing w:after="60"/>
+        <w:spacing w:after="20" w:line="240" w:lineRule="auto"/>
       </w:pPr>
       <w:r>
+        <w:rPr>
+          <w:sz w:val="20"/>
+        </w:rPr>
         <w:t>Maintain robot stability using an IMU.</w:t>
       </w:r>
     </w:p>
     <w:p>
       <w:pPr>
         <w:pStyle w:val="ListBullet"/>
-        <w:spacing w:after="60"/>
+        <w:spacing w:after="20" w:line="240" w:lineRule="auto"/>
       </w:pPr>
       <w:r>
-        <w:t>Add LiDAR, stereo cameras and distance sensors for future autonomous navigation and obstacle avoidance.</w:t>
+        <w:rPr>
+          <w:sz w:val="20"/>
+        </w:rPr>
+        <w:t>Add LiDAR, stereo cameras and distance sensors for autonomous navigation and obstacle avoidance.</w:t>
       </w:r>
     </w:p>
     <w:p>
       <w:pPr>
         <w:pStyle w:val="ListBullet"/>
-        <w:spacing w:after="60"/>
+        <w:spacing w:after="20" w:line="240" w:lineRule="auto"/>
       </w:pPr>
       <w:r>
-        <w:t>Evaluate the robot's performance in realistic agricultural environments.</w:t>
+        <w:rPr>
+          <w:sz w:val="20"/>
+        </w:rPr>
+        <w:t>Evaluate performance in realistic agricultural environments.</w:t>
       </w:r>
     </w:p>
     <w:p>
@@ -181,72 +171,15 @@
     </w:p>
     <w:p>
       <w:pPr>
-        <w:spacing w:after="140"/>
+        <w:spacing w:after="80"/>
       </w:pPr>
       <w:r>
         <w:rPr>
           <w:b w:val="0"/>
           <w:i w:val="0"/>
-          <w:sz w:val="22"/>
+          <w:sz w:val="20"/>
         </w:rPr>
-        <w:t>The robot has six legs with three degrees of freedom per leg, giving eighteen degrees of freedom in total. This provides high mobility and allows individual leg positions to be adjusted for uneven terrain.</w:t>
-      </w:r>
-    </w:p>
-    <w:p>
-      <w:pPr>
-        <w:spacing w:after="140"/>
-      </w:pPr>
-      <w:r>
-        <w:rPr>
-          <w:b w:val="0"/>
-          <w:i w:val="0"/>
-          <w:sz w:val="22"/>
-        </w:rPr>
-        <w:t>The robot uses a lightweight modular body and can operate in two clearance modes:</w:t>
-      </w:r>
-    </w:p>
-    <w:p>
-      <w:pPr>
-        <w:pStyle w:val="ListBullet"/>
-        <w:spacing w:after="60"/>
-      </w:pPr>
-      <w:r>
-        <w:t>Low-clearance mode: efficient movement on relatively flat terrain.</w:t>
-      </w:r>
-    </w:p>
-    <w:p>
-      <w:pPr>
-        <w:pStyle w:val="ListBullet"/>
-        <w:spacing w:after="60"/>
-      </w:pPr>
-      <w:r>
-        <w:t>High-clearance mode: used to cross taller obstacles.</w:t>
-      </w:r>
-    </w:p>
-    <w:p>
-      <w:pPr>
-        <w:spacing w:after="140"/>
-      </w:pPr>
-      <w:r>
-        <w:rPr>
-          <w:b w:val="0"/>
-          <w:i w:val="0"/>
-          <w:sz w:val="22"/>
-        </w:rPr>
-        <w:t>The standard robot uses an IMU and force sensors, while the advanced version adds LiDAR, stereo cameras and distance sensors.</w:t>
-      </w:r>
-    </w:p>
-    <w:p>
-      <w:pPr>
-        <w:spacing w:after="100"/>
-      </w:pPr>
-      <w:r>
-        <w:rPr>
-          <w:b w:val="0"/>
-          <w:i w:val="0"/>
-          <w:sz w:val="22"/>
-        </w:rPr>
-        <w:t>Important specifications:</w:t>
+        <w:t>The robot has six legs with three degrees of freedom each, giving eighteen degrees of freedom in total. This provides high mobility and allows individual leg positions to be adjusted for uneven terrain. The body is lightweight and modular, and the robot operates in two clearance modes: a low-clearance mode for efficient movement on relatively flat terrain, and a high-clearance mode for crossing taller obstacles. The standard version uses an IMU and force sensors; the advanced version adds LiDAR, stereo cameras and distance sensors.</w:t>
       </w:r>
     </w:p>
     <w:tbl>
@@ -257,24 +190,26 @@
         <w:tblLook w:firstColumn="1" w:firstRow="1" w:lastColumn="0" w:lastRow="0" w:noHBand="0" w:noVBand="1" w:val="04A0"/>
       </w:tblPr>
       <w:tblGrid>
-        <w:gridCol w:w="4752"/>
-        <w:gridCol w:w="4752"/>
+        <w:gridCol w:w="2556"/>
+        <w:gridCol w:w="2556"/>
+        <w:gridCol w:w="2556"/>
+        <w:gridCol w:w="2556"/>
       </w:tblGrid>
       <w:tr>
         <w:tc>
           <w:tcPr>
-            <w:tcW w:type="dxa" w:w="2736"/>
+            <w:tcW w:type="dxa" w:w="1512"/>
             <w:shd w:val="clear" w:color="auto" w:fill="E8E8E8"/>
           </w:tcPr>
           <w:p>
             <w:pPr>
-              <w:spacing w:after="40"/>
+              <w:spacing w:after="0"/>
             </w:pPr>
             <w:r/>
             <w:r>
               <w:rPr>
                 <w:b/>
-                <w:sz w:val="19"/>
+                <w:sz w:val="18"/>
               </w:rPr>
               <w:t>Specification</w:t>
             </w:r>
@@ -282,18 +217,56 @@
         </w:tc>
         <w:tc>
           <w:tcPr>
-            <w:tcW w:type="dxa" w:w="6624"/>
+            <w:tcW w:type="dxa" w:w="3456"/>
             <w:shd w:val="clear" w:color="auto" w:fill="E8E8E8"/>
           </w:tcPr>
           <w:p>
             <w:pPr>
-              <w:spacing w:after="40"/>
+              <w:spacing w:after="0"/>
             </w:pPr>
             <w:r/>
             <w:r>
               <w:rPr>
                 <w:b/>
-                <w:sz w:val="19"/>
+                <w:sz w:val="18"/>
+              </w:rPr>
+              <w:t>Value</w:t>
+            </w:r>
+          </w:p>
+        </w:tc>
+        <w:tc>
+          <w:tcPr>
+            <w:tcW w:type="dxa" w:w="1512"/>
+            <w:shd w:val="clear" w:color="auto" w:fill="E8E8E8"/>
+          </w:tcPr>
+          <w:p>
+            <w:pPr>
+              <w:spacing w:after="0"/>
+            </w:pPr>
+            <w:r/>
+            <w:r>
+              <w:rPr>
+                <w:b/>
+                <w:sz w:val="18"/>
+              </w:rPr>
+              <w:t>Specification</w:t>
+            </w:r>
+          </w:p>
+        </w:tc>
+        <w:tc>
+          <w:tcPr>
+            <w:tcW w:type="dxa" w:w="3744"/>
+            <w:shd w:val="clear" w:color="auto" w:fill="E8E8E8"/>
+          </w:tcPr>
+          <w:p>
+            <w:pPr>
+              <w:spacing w:after="0"/>
+            </w:pPr>
+            <w:r/>
+            <w:r>
+              <w:rPr>
+                <w:b/>
+                <w:sz w:val="18"/>
               </w:rPr>
               <w:t>Value</w:t>
             </w:r>
@@ -303,17 +276,17 @@
       <w:tr>
         <w:tc>
           <w:tcPr>
-            <w:tcW w:type="dxa" w:w="2736"/>
+            <w:tcW w:type="dxa" w:w="1512"/>
           </w:tcPr>
           <w:p>
             <w:pPr>
-              <w:spacing w:after="40"/>
+              <w:spacing w:after="0" w:line="240" w:lineRule="auto"/>
             </w:pPr>
             <w:r/>
             <w:r>
               <w:rPr>
                 <w:b/>
-                <w:sz w:val="19"/>
+                <w:sz w:val="18"/>
               </w:rPr>
               <w:t>Mass</w:t>
             </w:r>
@@ -321,113 +294,35 @@
         </w:tc>
         <w:tc>
           <w:tcPr>
-            <w:tcW w:type="dxa" w:w="6624"/>
+            <w:tcW w:type="dxa" w:w="3456"/>
           </w:tcPr>
           <w:p>
             <w:pPr>
-              <w:spacing w:after="40"/>
+              <w:spacing w:after="0" w:line="240" w:lineRule="auto"/>
             </w:pPr>
             <w:r/>
             <w:r>
               <w:rPr>
                 <w:b w:val="0"/>
-                <w:sz w:val="19"/>
+                <w:sz w:val="18"/>
               </w:rPr>
-              <w:t>4.2 kg without batteries, 4.7 kg with two batteries</w:t>
-            </w:r>
-          </w:p>
-        </w:tc>
-      </w:tr>
-      <w:tr>
-        <w:tc>
-          <w:tcPr>
-            <w:tcW w:type="dxa" w:w="2736"/>
-          </w:tcPr>
-          <w:p>
-            <w:pPr>
-              <w:spacing w:after="40"/>
-            </w:pPr>
-            <w:r/>
-            <w:r>
-              <w:rPr>
-                <w:b/>
-                <w:sz w:val="19"/>
-              </w:rPr>
-              <w:t>Payload</w:t>
+              <w:t>4.2 kg without batteries, 4.7 kg with two</w:t>
             </w:r>
           </w:p>
         </w:tc>
         <w:tc>
           <w:tcPr>
-            <w:tcW w:type="dxa" w:w="6624"/>
+            <w:tcW w:type="dxa" w:w="1512"/>
           </w:tcPr>
           <w:p>
             <w:pPr>
-              <w:spacing w:after="40"/>
+              <w:spacing w:after="0" w:line="240" w:lineRule="auto"/>
             </w:pPr>
             <w:r/>
             <w:r>
               <w:rPr>
                 <w:b w:val="0"/>
-                <w:sz w:val="19"/>
-              </w:rPr>
-              <w:t>8 kg</w:t>
-            </w:r>
-          </w:p>
-        </w:tc>
-      </w:tr>
-      <w:tr>
-        <w:tc>
-          <w:tcPr>
-            <w:tcW w:type="dxa" w:w="2736"/>
-          </w:tcPr>
-          <w:p>
-            <w:pPr>
-              <w:spacing w:after="40"/>
-            </w:pPr>
-            <w:r/>
-            <w:r>
-              <w:rPr>
-                <w:b/>
-                <w:sz w:val="19"/>
-              </w:rPr>
-              <w:t>Ground clearance</w:t>
-            </w:r>
-          </w:p>
-        </w:tc>
-        <w:tc>
-          <w:tcPr>
-            <w:tcW w:type="dxa" w:w="6624"/>
-          </w:tcPr>
-          <w:p>
-            <w:pPr>
-              <w:spacing w:after="40"/>
-            </w:pPr>
-            <w:r/>
-            <w:r>
-              <w:rPr>
-                <w:b w:val="0"/>
-                <w:sz w:val="19"/>
-              </w:rPr>
-              <w:t>6 to 18 cm</w:t>
-            </w:r>
-          </w:p>
-        </w:tc>
-      </w:tr>
-      <w:tr>
-        <w:tc>
-          <w:tcPr>
-            <w:tcW w:type="dxa" w:w="2736"/>
-          </w:tcPr>
-          <w:p>
-            <w:pPr>
-              <w:spacing w:after="40"/>
-            </w:pPr>
-            <w:r/>
-            <w:r>
-              <w:rPr>
-                <w:b/>
-                <w:sz w:val="19"/>
+                <w:sz w:val="18"/>
               </w:rPr>
               <w:t>Maximum speed</w:t>
             </w:r>
@@ -435,17 +330,17 @@
         </w:tc>
         <w:tc>
           <w:tcPr>
-            <w:tcW w:type="dxa" w:w="6624"/>
+            <w:tcW w:type="dxa" w:w="3744"/>
           </w:tcPr>
           <w:p>
             <w:pPr>
-              <w:spacing w:after="40"/>
+              <w:spacing w:after="0" w:line="240" w:lineRule="auto"/>
             </w:pPr>
             <w:r/>
             <w:r>
               <w:rPr>
                 <w:b w:val="0"/>
-                <w:sz w:val="19"/>
+                <w:sz w:val="18"/>
               </w:rPr>
               <w:t>Approximately 1.2 m/s</w:t>
             </w:r>
@@ -455,17 +350,53 @@
       <w:tr>
         <w:tc>
           <w:tcPr>
-            <w:tcW w:type="dxa" w:w="2736"/>
+            <w:tcW w:type="dxa" w:w="1512"/>
           </w:tcPr>
           <w:p>
             <w:pPr>
-              <w:spacing w:after="40"/>
+              <w:spacing w:after="0" w:line="240" w:lineRule="auto"/>
             </w:pPr>
             <w:r/>
             <w:r>
               <w:rPr>
                 <w:b/>
-                <w:sz w:val="19"/>
+                <w:sz w:val="18"/>
+              </w:rPr>
+              <w:t>Payload</w:t>
+            </w:r>
+          </w:p>
+        </w:tc>
+        <w:tc>
+          <w:tcPr>
+            <w:tcW w:type="dxa" w:w="3456"/>
+          </w:tcPr>
+          <w:p>
+            <w:pPr>
+              <w:spacing w:after="0" w:line="240" w:lineRule="auto"/>
+            </w:pPr>
+            <w:r/>
+            <w:r>
+              <w:rPr>
+                <w:b w:val="0"/>
+                <w:sz w:val="18"/>
+              </w:rPr>
+              <w:t>8 kg</w:t>
+            </w:r>
+          </w:p>
+        </w:tc>
+        <w:tc>
+          <w:tcPr>
+            <w:tcW w:type="dxa" w:w="1512"/>
+          </w:tcPr>
+          <w:p>
+            <w:pPr>
+              <w:spacing w:after="0" w:line="240" w:lineRule="auto"/>
+            </w:pPr>
+            <w:r/>
+            <w:r>
+              <w:rPr>
+                <w:b w:val="0"/>
+                <w:sz w:val="18"/>
               </w:rPr>
               <w:t>Battery</w:t>
             </w:r>
@@ -473,17 +404,17 @@
         </w:tc>
         <w:tc>
           <w:tcPr>
-            <w:tcW w:type="dxa" w:w="6624"/>
+            <w:tcW w:type="dxa" w:w="3744"/>
           </w:tcPr>
           <w:p>
             <w:pPr>
-              <w:spacing w:after="40"/>
+              <w:spacing w:after="0" w:line="240" w:lineRule="auto"/>
             </w:pPr>
             <w:r/>
             <w:r>
               <w:rPr>
                 <w:b w:val="0"/>
-                <w:sz w:val="19"/>
+                <w:sz w:val="18"/>
               </w:rPr>
               <w:t>Two 3S LiPo batteries</w:t>
             </w:r>
@@ -493,17 +424,53 @@
       <w:tr>
         <w:tc>
           <w:tcPr>
-            <w:tcW w:type="dxa" w:w="2736"/>
+            <w:tcW w:type="dxa" w:w="1512"/>
           </w:tcPr>
           <w:p>
             <w:pPr>
-              <w:spacing w:after="40"/>
+              <w:spacing w:after="0" w:line="240" w:lineRule="auto"/>
             </w:pPr>
             <w:r/>
             <w:r>
               <w:rPr>
                 <w:b/>
-                <w:sz w:val="19"/>
+                <w:sz w:val="18"/>
+              </w:rPr>
+              <w:t>Ground clearance</w:t>
+            </w:r>
+          </w:p>
+        </w:tc>
+        <w:tc>
+          <w:tcPr>
+            <w:tcW w:type="dxa" w:w="3456"/>
+          </w:tcPr>
+          <w:p>
+            <w:pPr>
+              <w:spacing w:after="0" w:line="240" w:lineRule="auto"/>
+            </w:pPr>
+            <w:r/>
+            <w:r>
+              <w:rPr>
+                <w:b w:val="0"/>
+                <w:sz w:val="18"/>
+              </w:rPr>
+              <w:t>6 to 18 cm</w:t>
+            </w:r>
+          </w:p>
+        </w:tc>
+        <w:tc>
+          <w:tcPr>
+            <w:tcW w:type="dxa" w:w="1512"/>
+          </w:tcPr>
+          <w:p>
+            <w:pPr>
+              <w:spacing w:after="0" w:line="240" w:lineRule="auto"/>
+            </w:pPr>
+            <w:r/>
+            <w:r>
+              <w:rPr>
+                <w:b w:val="0"/>
+                <w:sz w:val="18"/>
               </w:rPr>
               <w:t>Endurance</w:t>
             </w:r>
@@ -511,19 +478,19 @@
         </w:tc>
         <w:tc>
           <w:tcPr>
-            <w:tcW w:type="dxa" w:w="6624"/>
+            <w:tcW w:type="dxa" w:w="3744"/>
           </w:tcPr>
           <w:p>
             <w:pPr>
-              <w:spacing w:after="40"/>
+              <w:spacing w:after="0" w:line="240" w:lineRule="auto"/>
             </w:pPr>
             <w:r/>
             <w:r>
               <w:rPr>
                 <w:b w:val="0"/>
-                <w:sz w:val="19"/>
+                <w:sz w:val="18"/>
               </w:rPr>
-              <w:t>Up to 3 hours standing, approximately 1 hour travelling at 0.5 m/s</w:t>
+              <w:t>3 h standing, about 1 h at 0.5 m/s</w:t>
             </w:r>
           </w:p>
         </w:tc>
@@ -531,7 +498,7 @@
     </w:tbl>
     <w:p>
       <w:pPr>
-        <w:spacing w:after="100"/>
+        <w:spacing w:after="60"/>
       </w:pPr>
     </w:p>
     <w:p>
@@ -544,28 +511,15 @@
     </w:p>
     <w:p>
       <w:pPr>
-        <w:spacing w:after="140"/>
+        <w:spacing w:after="80"/>
       </w:pPr>
       <w:r>
         <w:rPr>
           <w:b w:val="0"/>
           <w:i w:val="0"/>
-          <w:sz w:val="22"/>
+          <w:sz w:val="20"/>
         </w:rPr>
-        <w:t>The key contribution is a terrain-adaptive locomotion system. The robot changes its gait and leg clearance according to the terrain and obstacle height.</w:t>
-      </w:r>
-    </w:p>
-    <w:p>
-      <w:pPr>
-        <w:spacing w:after="140"/>
-      </w:pPr>
-      <w:r>
-        <w:rPr>
-          <w:b w:val="0"/>
-          <w:i w:val="0"/>
-          <w:sz w:val="22"/>
-        </w:rPr>
-        <w:t>The controller receives information from the sensors and calculates joint angles, then walking speed, then direction, and finally the servo commands. This allows the robot to maintain stability while crossing uneven ground instead of using one fixed walking pattern.</w:t>
+        <w:t>The key contribution is a terrain-adaptive locomotion system: the robot changes its gait and leg clearance according to the terrain and obstacle height. The controller takes sensor information and computes joint angles, then walking speed, then direction, and finally the servo commands. This allows the robot to remain stable while crossing uneven ground instead of using one fixed walking pattern.</w:t>
       </w:r>
     </w:p>
     <w:p>
@@ -578,41 +532,15 @@
     </w:p>
     <w:p>
       <w:pPr>
-        <w:spacing w:after="140"/>
+        <w:spacing w:after="80"/>
       </w:pPr>
       <w:r>
         <w:rPr>
           <w:b w:val="0"/>
           <w:i w:val="0"/>
-          <w:sz w:val="22"/>
+          <w:sz w:val="20"/>
         </w:rPr>
-        <w:t>The robot was tested on concrete, grass, rugged grass, slopes, uneven terrain, and terrain containing obstacles.</w:t>
-      </w:r>
-    </w:p>
-    <w:p>
-      <w:pPr>
-        <w:spacing w:after="140"/>
-      </w:pPr>
-      <w:r>
-        <w:rPr>
-          <w:b w:val="0"/>
-          <w:i w:val="0"/>
-          <w:sz w:val="22"/>
-        </w:rPr>
-        <w:t>The robot maintained good stability, with pitch fluctuations between approximately −11.5° and +8.6°. It successfully operated on slopes of up to 17°.</w:t>
-      </w:r>
-    </w:p>
-    <w:p>
-      <w:pPr>
-        <w:spacing w:after="140"/>
-      </w:pPr>
-      <w:r>
-        <w:rPr>
-          <w:b w:val="0"/>
-          <w:i w:val="0"/>
-          <w:sz w:val="22"/>
-        </w:rPr>
-        <w:t>Most importantly, the terrain-adaptive algorithm reduced energy consumption by approximately 14.4% per obstacle crossed compared with traditional obstacle-avoidance methods.</w:t>
+        <w:t>The robot was tested on concrete, grass, rugged grass, slopes, uneven terrain, and terrain containing obstacles. It maintained good stability, with pitch fluctuations between approximately −11.5° and +8.6°, and operated successfully on slopes of up to 17°. Most importantly, the terrain-adaptive algorithm reduced energy consumption by approximately 14.4% per obstacle crossed compared with traditional obstacle-avoidance methods.</w:t>
       </w:r>
     </w:p>
     <w:p>
@@ -625,49 +553,28 @@
     </w:p>
     <w:p>
       <w:pPr>
-        <w:spacing w:after="140"/>
+        <w:spacing w:after="80"/>
       </w:pPr>
       <w:r>
         <w:rPr>
           <w:b w:val="0"/>
           <w:i w:val="0"/>
-          <w:sz w:val="22"/>
+          <w:sz w:val="20"/>
         </w:rPr>
-        <w:t>The study demonstrates that a bionic hexapod with adaptive gait and variable clearance can provide excellent terrain adaptability for agricultural applications. Its six-legged structure provides multiple support points, allowing it to remain stable while navigating difficult terrain.</w:t>
+        <w:t>The study demonstrates that a bionic hexapod with adaptive gait and variable clearance provides excellent terrain adaptability for agricultural applications. Its six-legged structure gives multiple support points, allowing it to remain stable over difficult terrain. The authors conclude that the robot has strong potential for precision agriculture, field scouting and autonomous agricultural operations, with future work on energy efficiency, durability and compatibility with different crops.</w:t>
       </w:r>
     </w:p>
     <w:p>
       <w:pPr>
-        <w:spacing w:after="140"/>
-      </w:pPr>
-      <w:r>
-        <w:rPr>
-          <w:b w:val="0"/>
-          <w:i w:val="0"/>
-          <w:sz w:val="22"/>
-        </w:rPr>
-        <w:t>The authors conclude that the robot has strong potential for precision agriculture, field scouting and autonomous agricultural operations. Future work focuses on improving energy efficiency, durability and compatibility with different crops and farming environments.</w:t>
-      </w:r>
-    </w:p>
-    <w:p>
-      <w:pPr>
-        <w:pStyle w:val="Heading2"/>
-      </w:pPr>
-      <w:r>
-        <w:t>Key Takeaway</w:t>
-      </w:r>
-    </w:p>
-    <w:p>
-      <w:pPr>
-        <w:spacing w:after="140"/>
+        <w:spacing w:after="120"/>
       </w:pPr>
       <w:r>
         <w:rPr>
           <w:b/>
           <w:i w:val="0"/>
-          <w:sz w:val="22"/>
+          <w:sz w:val="20"/>
         </w:rPr>
-        <w:t>The major idea of the paper is that a hexapod robot can use its 18-DOF leg system, sensors and adaptive gait to automatically change how it walks and how high it lifts its legs, allowing stable and energy-efficient movement through difficult agricultural terrain.</w:t>
+        <w:t>Key takeaway: a hexapod can use its 18-DOF leg system, sensors and adaptive gait to automatically change how it walks and how high it lifts its legs, allowing stable and energy-efficient movement through difficult agricultural terrain.</w:t>
       </w:r>
     </w:p>
     <w:p>
@@ -685,15 +592,15 @@
     </w:p>
     <w:p>
       <w:pPr>
-        <w:spacing w:after="160"/>
+        <w:spacing w:after="80"/>
       </w:pPr>
       <w:r>
         <w:rPr>
           <w:b w:val="0"/>
           <w:i w:val="0"/>
-          <w:sz w:val="22"/>
+          <w:sz w:val="20"/>
         </w:rPr>
-        <w:t>The paper is a useful benchmark because the machine is almost the same as ours. Six legs with three degrees of freedom each, the tripod gait as the starting point, forward and inverse kinematics presented for the leg, and simulation carried out before hardware. Every difference below is therefore a genuine engineering choice rather than a difference of scale.</w:t>
+        <w:t>The paper is a useful benchmark because the machine is almost identical to ours: six legs with three degrees of freedom, the tripod gait as the starting point, kinematics presented for the leg, and simulation carried out before hardware. Every difference below is therefore a genuine engineering choice rather than a difference of scale.</w:t>
       </w:r>
     </w:p>
     <w:tbl>
@@ -704,43 +611,43 @@
         <w:tblLook w:firstColumn="1" w:firstRow="1" w:lastColumn="0" w:lastRow="0" w:noHBand="0" w:noVBand="1" w:val="04A0"/>
       </w:tblPr>
       <w:tblGrid>
-        <w:gridCol w:w="3168"/>
-        <w:gridCol w:w="3168"/>
-        <w:gridCol w:w="3168"/>
+        <w:gridCol w:w="3408"/>
+        <w:gridCol w:w="3408"/>
+        <w:gridCol w:w="3408"/>
       </w:tblGrid>
       <w:tr>
         <w:tc>
           <w:tcPr>
-            <w:tcW w:type="dxa" w:w="1944"/>
+            <w:tcW w:type="dxa" w:w="1440"/>
             <w:shd w:val="clear" w:color="auto" w:fill="E8E8E8"/>
           </w:tcPr>
           <w:p>
             <w:pPr>
-              <w:spacing w:after="40"/>
+              <w:spacing w:after="0"/>
             </w:pPr>
             <w:r/>
             <w:r>
               <w:rPr>
                 <w:b/>
-                <w:sz w:val="19"/>
+                <w:sz w:val="18"/>
               </w:rPr>
             </w:r>
           </w:p>
         </w:tc>
         <w:tc>
           <w:tcPr>
-            <w:tcW w:type="dxa" w:w="3744"/>
+            <w:tcW w:type="dxa" w:w="4392"/>
             <w:shd w:val="clear" w:color="auto" w:fill="E8E8E8"/>
           </w:tcPr>
           <w:p>
             <w:pPr>
-              <w:spacing w:after="40"/>
+              <w:spacing w:after="0"/>
             </w:pPr>
             <w:r/>
             <w:r>
               <w:rPr>
                 <w:b/>
-                <w:sz w:val="19"/>
+                <w:sz w:val="18"/>
               </w:rPr>
               <w:t>Zhang et al., 2024</w:t>
             </w:r>
@@ -748,18 +655,18 @@
         </w:tc>
         <w:tc>
           <w:tcPr>
-            <w:tcW w:type="dxa" w:w="3672"/>
+            <w:tcW w:type="dxa" w:w="4392"/>
             <w:shd w:val="clear" w:color="auto" w:fill="E8E8E8"/>
           </w:tcPr>
           <w:p>
             <w:pPr>
-              <w:spacing w:after="40"/>
+              <w:spacing w:after="0"/>
             </w:pPr>
             <w:r/>
             <w:r>
               <w:rPr>
                 <w:b/>
-                <w:sz w:val="19"/>
+                <w:sz w:val="18"/>
               </w:rPr>
               <w:t>Our project</w:t>
             </w:r>
@@ -769,17 +676,17 @@
       <w:tr>
         <w:tc>
           <w:tcPr>
-            <w:tcW w:type="dxa" w:w="1944"/>
+            <w:tcW w:type="dxa" w:w="1440"/>
           </w:tcPr>
           <w:p>
             <w:pPr>
-              <w:spacing w:after="40"/>
+              <w:spacing w:after="0" w:line="240" w:lineRule="auto"/>
             </w:pPr>
             <w:r/>
             <w:r>
               <w:rPr>
                 <w:b/>
-                <w:sz w:val="19"/>
+                <w:sz w:val="18"/>
               </w:rPr>
               <w:t>Topology</w:t>
             </w:r>
@@ -787,17 +694,17 @@
         </w:tc>
         <w:tc>
           <w:tcPr>
-            <w:tcW w:type="dxa" w:w="3744"/>
+            <w:tcW w:type="dxa" w:w="4392"/>
           </w:tcPr>
           <w:p>
             <w:pPr>
-              <w:spacing w:after="40"/>
+              <w:spacing w:after="0" w:line="240" w:lineRule="auto"/>
             </w:pPr>
             <w:r/>
             <w:r>
               <w:rPr>
                 <w:b w:val="0"/>
-                <w:sz w:val="19"/>
+                <w:sz w:val="18"/>
               </w:rPr>
               <w:t>6 legs x 3 DOF, tripod gait as base</w:t>
             </w:r>
@@ -805,17 +712,17 @@
         </w:tc>
         <w:tc>
           <w:tcPr>
-            <w:tcW w:type="dxa" w:w="3672"/>
+            <w:tcW w:type="dxa" w:w="4392"/>
           </w:tcPr>
           <w:p>
             <w:pPr>
-              <w:spacing w:after="40"/>
+              <w:spacing w:after="0" w:line="240" w:lineRule="auto"/>
             </w:pPr>
             <w:r/>
             <w:r>
               <w:rPr>
                 <w:b w:val="0"/>
-                <w:sz w:val="19"/>
+                <w:sz w:val="18"/>
               </w:rPr>
               <w:t>Same</w:t>
             </w:r>
@@ -825,17 +732,17 @@
       <w:tr>
         <w:tc>
           <w:tcPr>
-            <w:tcW w:type="dxa" w:w="1944"/>
+            <w:tcW w:type="dxa" w:w="1440"/>
           </w:tcPr>
           <w:p>
             <w:pPr>
-              <w:spacing w:after="40"/>
+              <w:spacing w:after="0" w:line="240" w:lineRule="auto"/>
             </w:pPr>
             <w:r/>
             <w:r>
               <w:rPr>
                 <w:b/>
-                <w:sz w:val="19"/>
+                <w:sz w:val="18"/>
               </w:rPr>
               <w:t>Mass</w:t>
             </w:r>
@@ -843,17 +750,17 @@
         </w:tc>
         <w:tc>
           <w:tcPr>
-            <w:tcW w:type="dxa" w:w="3744"/>
+            <w:tcW w:type="dxa" w:w="4392"/>
           </w:tcPr>
           <w:p>
             <w:pPr>
-              <w:spacing w:after="40"/>
+              <w:spacing w:after="0" w:line="240" w:lineRule="auto"/>
             </w:pPr>
             <w:r/>
             <w:r>
               <w:rPr>
                 <w:b w:val="0"/>
-                <w:sz w:val="19"/>
+                <w:sz w:val="18"/>
               </w:rPr>
               <w:t>4.7 kg with batteries, 8 kg payload</w:t>
             </w:r>
@@ -861,17 +768,17 @@
         </w:tc>
         <w:tc>
           <w:tcPr>
-            <w:tcW w:type="dxa" w:w="3672"/>
+            <w:tcW w:type="dxa" w:w="4392"/>
           </w:tcPr>
           <w:p>
             <w:pPr>
-              <w:spacing w:after="40"/>
+              <w:spacing w:after="0" w:line="240" w:lineRule="auto"/>
             </w:pPr>
             <w:r/>
             <w:r>
               <w:rPr>
                 <w:b w:val="0"/>
-                <w:sz w:val="19"/>
+                <w:sz w:val="18"/>
               </w:rPr>
               <w:t>3.39 kg</w:t>
             </w:r>
@@ -881,17 +788,17 @@
       <w:tr>
         <w:tc>
           <w:tcPr>
-            <w:tcW w:type="dxa" w:w="1944"/>
+            <w:tcW w:type="dxa" w:w="1440"/>
           </w:tcPr>
           <w:p>
             <w:pPr>
-              <w:spacing w:after="40"/>
+              <w:spacing w:after="0" w:line="240" w:lineRule="auto"/>
             </w:pPr>
             <w:r/>
             <w:r>
               <w:rPr>
                 <w:b/>
-                <w:sz w:val="19"/>
+                <w:sz w:val="18"/>
               </w:rPr>
               <w:t>Structure</w:t>
             </w:r>
@@ -899,47 +806,35 @@
         </w:tc>
         <w:tc>
           <w:tcPr>
-            <w:tcW w:type="dxa" w:w="3744"/>
+            <w:tcW w:type="dxa" w:w="4392"/>
           </w:tcPr>
           <w:p>
             <w:pPr>
-              <w:spacing w:after="40"/>
+              <w:spacing w:after="0" w:line="240" w:lineRule="auto"/>
             </w:pPr>
             <w:r/>
             <w:r>
               <w:rPr>
                 <w:b w:val="0"/>
-                <w:sz w:val="19"/>
+                <w:sz w:val="18"/>
               </w:rPr>
-              <w:t>Carbon fibre plates, CNC aluminium for</w:t>
-            </w:r>
-          </w:p>
-          <w:p>
-            <w:pPr>
-              <w:spacing w:after="40"/>
-            </w:pPr>
-            <w:r>
-              <w:rPr>
-                <w:b w:val="0"/>
-                <w:sz w:val="19"/>
-              </w:rPr>
-              <w:t>stressed parts, 3D printing elsewhere</w:t>
+              <w:t>Carbon fibre and CNC aluminium</w:t>
             </w:r>
           </w:p>
         </w:tc>
         <w:tc>
           <w:tcPr>
-            <w:tcW w:type="dxa" w:w="3672"/>
+            <w:tcW w:type="dxa" w:w="4392"/>
           </w:tcPr>
           <w:p>
             <w:pPr>
-              <w:spacing w:after="40"/>
+              <w:spacing w:after="0" w:line="240" w:lineRule="auto"/>
             </w:pPr>
             <w:r/>
             <w:r>
               <w:rPr>
                 <w:b w:val="0"/>
-                <w:sz w:val="19"/>
+                <w:sz w:val="18"/>
               </w:rPr>
               <w:t>3D printed PLA throughout</w:t>
             </w:r>
@@ -949,17 +844,17 @@
       <w:tr>
         <w:tc>
           <w:tcPr>
-            <w:tcW w:type="dxa" w:w="1944"/>
+            <w:tcW w:type="dxa" w:w="1440"/>
           </w:tcPr>
           <w:p>
             <w:pPr>
-              <w:spacing w:after="40"/>
+              <w:spacing w:after="0" w:line="240" w:lineRule="auto"/>
             </w:pPr>
             <w:r/>
             <w:r>
               <w:rPr>
                 <w:b/>
-                <w:sz w:val="19"/>
+                <w:sz w:val="18"/>
               </w:rPr>
               <w:t>Foot trajectory</w:t>
             </w:r>
@@ -967,73 +862,37 @@
         </w:tc>
         <w:tc>
           <w:tcPr>
-            <w:tcW w:type="dxa" w:w="3744"/>
+            <w:tcW w:type="dxa" w:w="4392"/>
           </w:tcPr>
           <w:p>
             <w:pPr>
-              <w:spacing w:after="40"/>
+              <w:spacing w:after="0" w:line="240" w:lineRule="auto"/>
             </w:pPr>
             <w:r/>
             <w:r>
               <w:rPr>
                 <w:b w:val="0"/>
-                <w:sz w:val="19"/>
+                <w:sz w:val="18"/>
               </w:rPr>
-              <w:t>Sinusoidal joint modulation.</w:t>
-            </w:r>
-          </w:p>
-          <w:p>
-            <w:pPr>
-              <w:spacing w:after="40"/>
-            </w:pPr>
-            <w:r>
-              <w:rPr>
-                <w:b w:val="0"/>
-                <w:sz w:val="19"/>
-              </w:rPr>
-              <w:t>Inverse kinematics deliberately avoided</w:t>
-            </w:r>
-          </w:p>
-          <w:p>
-            <w:pPr>
-              <w:spacing w:after="40"/>
-            </w:pPr>
-            <w:r>
-              <w:rPr>
-                <w:b w:val="0"/>
-                <w:sz w:val="19"/>
-              </w:rPr>
-              <w:t>at run time</w:t>
+              <w:t>Sinusoidal joint modulation; IK avoided at run time</w:t>
             </w:r>
           </w:p>
         </w:tc>
         <w:tc>
           <w:tcPr>
-            <w:tcW w:type="dxa" w:w="3672"/>
+            <w:tcW w:type="dxa" w:w="4392"/>
           </w:tcPr>
           <w:p>
             <w:pPr>
-              <w:spacing w:after="40"/>
+              <w:spacing w:after="0" w:line="240" w:lineRule="auto"/>
             </w:pPr>
             <w:r/>
             <w:r>
               <w:rPr>
                 <w:b w:val="0"/>
-                <w:sz w:val="19"/>
+                <w:sz w:val="18"/>
               </w:rPr>
-              <w:t>Closed-form analytic inverse kinematics,</w:t>
-            </w:r>
-          </w:p>
-          <w:p>
-            <w:pPr>
-              <w:spacing w:after="40"/>
-            </w:pPr>
-            <w:r>
-              <w:rPr>
-                <w:b w:val="0"/>
-                <w:sz w:val="19"/>
-              </w:rPr>
-              <w:t>solved at 50 Hz</w:t>
+              <w:t>Closed-form analytic IK at 50 Hz</w:t>
             </w:r>
           </w:p>
         </w:tc>
@@ -1041,17 +900,17 @@
       <w:tr>
         <w:tc>
           <w:tcPr>
-            <w:tcW w:type="dxa" w:w="1944"/>
+            <w:tcW w:type="dxa" w:w="1440"/>
           </w:tcPr>
           <w:p>
             <w:pPr>
-              <w:spacing w:after="40"/>
+              <w:spacing w:after="0" w:line="240" w:lineRule="auto"/>
             </w:pPr>
             <w:r/>
             <w:r>
               <w:rPr>
                 <w:b/>
-                <w:sz w:val="19"/>
+                <w:sz w:val="18"/>
               </w:rPr>
               <w:t>Commanding</w:t>
             </w:r>
@@ -1059,17 +918,17 @@
         </w:tc>
         <w:tc>
           <w:tcPr>
-            <w:tcW w:type="dxa" w:w="3744"/>
+            <w:tcW w:type="dxa" w:w="4392"/>
           </w:tcPr>
           <w:p>
             <w:pPr>
-              <w:spacing w:after="40"/>
+              <w:spacing w:after="0" w:line="240" w:lineRule="auto"/>
             </w:pPr>
             <w:r/>
             <w:r>
               <w:rPr>
                 <w:b w:val="0"/>
-                <w:sz w:val="19"/>
+                <w:sz w:val="18"/>
               </w:rPr>
               <w:t>A gait mode is selected</w:t>
             </w:r>
@@ -1077,31 +936,19 @@
         </w:tc>
         <w:tc>
           <w:tcPr>
-            <w:tcW w:type="dxa" w:w="3672"/>
+            <w:tcW w:type="dxa" w:w="4392"/>
           </w:tcPr>
           <w:p>
             <w:pPr>
-              <w:spacing w:after="40"/>
+              <w:spacing w:after="0" w:line="240" w:lineRule="auto"/>
             </w:pPr>
             <w:r/>
             <w:r>
               <w:rPr>
                 <w:b w:val="0"/>
-                <w:sz w:val="19"/>
+                <w:sz w:val="18"/>
               </w:rPr>
-              <w:t>A body velocity is commanded and the</w:t>
-            </w:r>
-          </w:p>
-          <w:p>
-            <w:pPr>
-              <w:spacing w:after="40"/>
-            </w:pPr>
-            <w:r>
-              <w:rPr>
-                <w:b w:val="0"/>
-                <w:sz w:val="19"/>
-              </w:rPr>
-              <w:t>stride is derived from it</w:t>
+              <w:t>A body velocity is commanded, stride derived</w:t>
             </w:r>
           </w:p>
         </w:tc>
@@ -1109,17 +956,17 @@
       <w:tr>
         <w:tc>
           <w:tcPr>
-            <w:tcW w:type="dxa" w:w="1944"/>
+            <w:tcW w:type="dxa" w:w="1440"/>
           </w:tcPr>
           <w:p>
             <w:pPr>
-              <w:spacing w:after="40"/>
+              <w:spacing w:after="0" w:line="240" w:lineRule="auto"/>
             </w:pPr>
             <w:r/>
             <w:r>
               <w:rPr>
                 <w:b/>
-                <w:sz w:val="19"/>
+                <w:sz w:val="18"/>
               </w:rPr>
               <w:t>Clearance</w:t>
             </w:r>
@@ -1127,49 +974,37 @@
         </w:tc>
         <w:tc>
           <w:tcPr>
-            <w:tcW w:type="dxa" w:w="3744"/>
+            <w:tcW w:type="dxa" w:w="4392"/>
           </w:tcPr>
           <w:p>
             <w:pPr>
-              <w:spacing w:after="40"/>
+              <w:spacing w:after="0" w:line="240" w:lineRule="auto"/>
             </w:pPr>
             <w:r/>
             <w:r>
               <w:rPr>
                 <w:b w:val="0"/>
-                <w:sz w:val="19"/>
+                <w:sz w:val="18"/>
               </w:rPr>
-              <w:t>Adjustable, 6 to 18 cm, terrain adaptive</w:t>
+              <w:t>Adjustable 6 to 18 cm, terrain adaptive</w:t>
             </w:r>
           </w:p>
         </w:tc>
         <w:tc>
           <w:tcPr>
-            <w:tcW w:type="dxa" w:w="3672"/>
+            <w:tcW w:type="dxa" w:w="4392"/>
           </w:tcPr>
           <w:p>
             <w:pPr>
-              <w:spacing w:after="40"/>
+              <w:spacing w:after="0" w:line="240" w:lineRule="auto"/>
             </w:pPr>
             <w:r/>
             <w:r>
               <w:rPr>
                 <w:b w:val="0"/>
-                <w:sz w:val="19"/>
+                <w:sz w:val="18"/>
               </w:rPr>
-              <w:t>Fixed 45 mm, but already a parameter</w:t>
-            </w:r>
-          </w:p>
-          <w:p>
-            <w:pPr>
-              <w:spacing w:after="40"/>
-            </w:pPr>
-            <w:r>
-              <w:rPr>
-                <w:b w:val="0"/>
-                <w:sz w:val="19"/>
-              </w:rPr>
-              <w:t>of the swing equation</w:t>
+              <w:t>Fixed 45 mm, already a gait parameter</w:t>
             </w:r>
           </w:p>
         </w:tc>
@@ -1177,17 +1012,17 @@
       <w:tr>
         <w:tc>
           <w:tcPr>
-            <w:tcW w:type="dxa" w:w="1944"/>
+            <w:tcW w:type="dxa" w:w="1440"/>
           </w:tcPr>
           <w:p>
             <w:pPr>
-              <w:spacing w:after="40"/>
+              <w:spacing w:after="0" w:line="240" w:lineRule="auto"/>
             </w:pPr>
             <w:r/>
             <w:r>
               <w:rPr>
                 <w:b/>
-                <w:sz w:val="19"/>
+                <w:sz w:val="18"/>
               </w:rPr>
               <w:t>Simulation</w:t>
             </w:r>
@@ -1195,17 +1030,17 @@
         </w:tc>
         <w:tc>
           <w:tcPr>
-            <w:tcW w:type="dxa" w:w="3744"/>
+            <w:tcW w:type="dxa" w:w="4392"/>
           </w:tcPr>
           <w:p>
             <w:pPr>
-              <w:spacing w:after="40"/>
+              <w:spacing w:after="0" w:line="240" w:lineRule="auto"/>
             </w:pPr>
             <w:r/>
             <w:r>
               <w:rPr>
                 <w:b w:val="0"/>
-                <w:sz w:val="19"/>
+                <w:sz w:val="18"/>
               </w:rPr>
               <w:t>SolidWorks into Simulink Simscape</w:t>
             </w:r>
@@ -1213,31 +1048,19 @@
         </w:tc>
         <w:tc>
           <w:tcPr>
-            <w:tcW w:type="dxa" w:w="3672"/>
+            <w:tcW w:type="dxa" w:w="4392"/>
           </w:tcPr>
           <w:p>
             <w:pPr>
-              <w:spacing w:after="40"/>
+              <w:spacing w:after="0" w:line="240" w:lineRule="auto"/>
             </w:pPr>
             <w:r/>
             <w:r>
               <w:rPr>
                 <w:b w:val="0"/>
-                <w:sz w:val="19"/>
+                <w:sz w:val="18"/>
               </w:rPr>
-              <w:t>AutoCAD into URDF, Gazebo with</w:t>
-            </w:r>
-          </w:p>
-          <w:p>
-            <w:pPr>
-              <w:spacing w:after="40"/>
-            </w:pPr>
-            <w:r>
-              <w:rPr>
-                <w:b w:val="0"/>
-                <w:sz w:val="19"/>
-              </w:rPr>
-              <w:t>ros2_control</w:t>
+              <w:t>AutoCAD into URDF, Gazebo, ros2_control</w:t>
             </w:r>
           </w:p>
         </w:tc>
@@ -1245,17 +1068,17 @@
       <w:tr>
         <w:tc>
           <w:tcPr>
-            <w:tcW w:type="dxa" w:w="1944"/>
+            <w:tcW w:type="dxa" w:w="1440"/>
           </w:tcPr>
           <w:p>
             <w:pPr>
-              <w:spacing w:after="40"/>
+              <w:spacing w:after="0" w:line="240" w:lineRule="auto"/>
             </w:pPr>
             <w:r/>
             <w:r>
               <w:rPr>
                 <w:b/>
-                <w:sz w:val="19"/>
+                <w:sz w:val="18"/>
               </w:rPr>
               <w:t>Sensing</w:t>
             </w:r>
@@ -1263,17 +1086,17 @@
         </w:tc>
         <w:tc>
           <w:tcPr>
-            <w:tcW w:type="dxa" w:w="3744"/>
+            <w:tcW w:type="dxa" w:w="4392"/>
           </w:tcPr>
           <w:p>
             <w:pPr>
-              <w:spacing w:after="40"/>
+              <w:spacing w:after="0" w:line="240" w:lineRule="auto"/>
             </w:pPr>
             <w:r/>
             <w:r>
               <w:rPr>
                 <w:b w:val="0"/>
-                <w:sz w:val="19"/>
+                <w:sz w:val="18"/>
               </w:rPr>
               <w:t>IMU and one force sensor per foot</w:t>
             </w:r>
@@ -1281,31 +1104,19 @@
         </w:tc>
         <w:tc>
           <w:tcPr>
-            <w:tcW w:type="dxa" w:w="3672"/>
+            <w:tcW w:type="dxa" w:w="4392"/>
           </w:tcPr>
           <w:p>
             <w:pPr>
-              <w:spacing w:after="40"/>
+              <w:spacing w:after="0" w:line="240" w:lineRule="auto"/>
             </w:pPr>
             <w:r/>
             <w:r>
               <w:rPr>
                 <w:b w:val="0"/>
-                <w:sz w:val="19"/>
+                <w:sz w:val="18"/>
               </w:rPr>
-              <w:t>Foot contact sensors modelled,</w:t>
-            </w:r>
-          </w:p>
-          <w:p>
-            <w:pPr>
-              <w:spacing w:after="40"/>
-            </w:pPr>
-            <w:r>
-              <w:rPr>
-                <w:b w:val="0"/>
-                <w:sz w:val="19"/>
-              </w:rPr>
-              <w:t>currently disabled</w:t>
+              <w:t>Foot sensors modelled, currently disabled</w:t>
             </w:r>
           </w:p>
         </w:tc>
@@ -1313,17 +1124,17 @@
       <w:tr>
         <w:tc>
           <w:tcPr>
-            <w:tcW w:type="dxa" w:w="1944"/>
+            <w:tcW w:type="dxa" w:w="1440"/>
           </w:tcPr>
           <w:p>
             <w:pPr>
-              <w:spacing w:after="40"/>
+              <w:spacing w:after="0" w:line="240" w:lineRule="auto"/>
             </w:pPr>
             <w:r/>
             <w:r>
               <w:rPr>
                 <w:b/>
-                <w:sz w:val="19"/>
+                <w:sz w:val="18"/>
               </w:rPr>
               <w:t>Validation</w:t>
             </w:r>
@@ -1331,17 +1142,17 @@
         </w:tc>
         <w:tc>
           <w:tcPr>
-            <w:tcW w:type="dxa" w:w="3744"/>
+            <w:tcW w:type="dxa" w:w="4392"/>
           </w:tcPr>
           <w:p>
             <w:pPr>
-              <w:spacing w:after="40"/>
+              <w:spacing w:after="0" w:line="240" w:lineRule="auto"/>
             </w:pPr>
             <w:r/>
             <w:r>
               <w:rPr>
                 <w:b w:val="0"/>
-                <w:sz w:val="19"/>
+                <w:sz w:val="18"/>
               </w:rPr>
               <w:t>Field trials on four terrain types</w:t>
             </w:r>
@@ -1349,31 +1160,19 @@
         </w:tc>
         <w:tc>
           <w:tcPr>
-            <w:tcW w:type="dxa" w:w="3672"/>
+            <w:tcW w:type="dxa" w:w="4392"/>
           </w:tcPr>
           <w:p>
             <w:pPr>
-              <w:spacing w:after="40"/>
+              <w:spacing w:after="0" w:line="240" w:lineRule="auto"/>
             </w:pPr>
             <w:r/>
             <w:r>
               <w:rPr>
                 <w:b w:val="0"/>
-                <w:sz w:val="19"/>
+                <w:sz w:val="18"/>
               </w:rPr>
-              <w:t>498 offline assertions, inverse</w:t>
-            </w:r>
-          </w:p>
-          <w:p>
-            <w:pPr>
-              <w:spacing w:after="40"/>
-            </w:pPr>
-            <w:r>
-              <w:rPr>
-                <w:b w:val="0"/>
-                <w:sz w:val="19"/>
-              </w:rPr>
-              <w:t>kinematics exact to 3.5e-16 m</w:t>
+              <w:t>498 offline assertions, IK exact to 3.5e-16 m</w:t>
             </w:r>
           </w:p>
         </w:tc>
@@ -1381,17 +1180,17 @@
       <w:tr>
         <w:tc>
           <w:tcPr>
-            <w:tcW w:type="dxa" w:w="1944"/>
+            <w:tcW w:type="dxa" w:w="1440"/>
           </w:tcPr>
           <w:p>
             <w:pPr>
-              <w:spacing w:after="40"/>
+              <w:spacing w:after="0" w:line="240" w:lineRule="auto"/>
             </w:pPr>
             <w:r/>
             <w:r>
               <w:rPr>
                 <w:b/>
-                <w:sz w:val="19"/>
+                <w:sz w:val="18"/>
               </w:rPr>
               <w:t>Stage</w:t>
             </w:r>
@@ -1399,17 +1198,17 @@
         </w:tc>
         <w:tc>
           <w:tcPr>
-            <w:tcW w:type="dxa" w:w="3744"/>
+            <w:tcW w:type="dxa" w:w="4392"/>
           </w:tcPr>
           <w:p>
             <w:pPr>
-              <w:spacing w:after="40"/>
+              <w:spacing w:after="0" w:line="240" w:lineRule="auto"/>
             </w:pPr>
             <w:r/>
             <w:r>
               <w:rPr>
                 <w:b w:val="0"/>
-                <w:sz w:val="19"/>
+                <w:sz w:val="18"/>
               </w:rPr>
               <w:t>Hardware built and field tested</w:t>
             </w:r>
@@ -1417,17 +1216,17 @@
         </w:tc>
         <w:tc>
           <w:tcPr>
-            <w:tcW w:type="dxa" w:w="3672"/>
+            <w:tcW w:type="dxa" w:w="4392"/>
           </w:tcPr>
           <w:p>
             <w:pPr>
-              <w:spacing w:after="40"/>
+              <w:spacing w:after="0" w:line="240" w:lineRule="auto"/>
             </w:pPr>
             <w:r/>
             <w:r>
               <w:rPr>
                 <w:b w:val="0"/>
-                <w:sz w:val="19"/>
+                <w:sz w:val="18"/>
               </w:rPr>
               <w:t>Simulation complete, hardware next</w:t>
             </w:r>
@@ -1437,7 +1236,7 @@
     </w:tbl>
     <w:p>
       <w:pPr>
-        <w:spacing w:after="100"/>
+        <w:spacing w:after="60"/>
       </w:pPr>
     </w:p>
     <w:p>
@@ -1450,41 +1249,15 @@
     </w:p>
     <w:p>
       <w:pPr>
-        <w:spacing w:after="140"/>
+        <w:spacing w:after="80"/>
       </w:pPr>
       <w:r>
         <w:rPr>
           <w:b w:val="0"/>
           <w:i w:val="0"/>
-          <w:sz w:val="22"/>
+          <w:sz w:val="20"/>
         </w:rPr>
-        <w:t>The paper deliberately avoids inverse kinematics at run time. Its argument is that computing the landing point at each step and solving inverse kinematics generates many complex computations and costs time and energy, so the joints are driven by sinusoidal modulation instead.</w:t>
-      </w:r>
-    </w:p>
-    <w:p>
-      <w:pPr>
-        <w:spacing w:after="140"/>
-      </w:pPr>
-      <w:r>
-        <w:rPr>
-          <w:b w:val="0"/>
-          <w:i w:val="0"/>
-          <w:sz w:val="22"/>
-        </w:rPr>
-        <w:t>That objection applies to numerical inverse kinematics, which iterates. Ours is closed form: a fixed number of trigonometric evaluations, no iteration, no risk of failing to converge, and the same cost on every call. It is inexpensive, and it buys something the sinusoidal method cannot offer. With sinusoidal modulation the foot path is whatever the sinusoids produce and the operator selects a gait mode. With analytic inverse kinematics the operator commands a body velocity and the stride for every leg follows from geometry, which is why walking, strafing, turning on the spot and driving an arc are the same piece of code rather than separate cases.</w:t>
-      </w:r>
-    </w:p>
-    <w:p>
-      <w:pPr>
-        <w:spacing w:after="140"/>
-      </w:pPr>
-      <w:r>
-        <w:rPr>
-          <w:b/>
-          <w:i w:val="0"/>
-          <w:sz w:val="22"/>
-        </w:rPr>
-        <w:t>In short, their design trades commandability for computation, and ours trades computation for commandability. A closed-form solution is what makes that trade affordable. Both are correct engineering: theirs suits a battery-limited scouting robot where cost of transport is the headline metric.</w:t>
+        <w:t>The paper deliberately avoids inverse kinematics at run time, arguing that solving it at each step is computationally expensive, and drives the joints with sinusoidal modulation instead. That objection applies to numerical inverse kinematics, which iterates. Ours is closed form: a fixed number of trigonometric evaluations, no iteration, and the same cost on every call. It is inexpensive, and it buys what the sinusoidal method cannot offer. With sinusoidal modulation the operator selects a gait mode; with analytic inverse kinematics the operator commands a body velocity and the stride for every leg follows from geometry, which is why walking, strafing, turning and driving an arc are one piece of code. In short, their design trades commandability for computation and ours trades computation for commandability; a closed-form solution is what makes that trade affordable. Both are valid: theirs suits a battery-limited scouting robot where cost of transport is the headline metric.</w:t>
       </w:r>
     </w:p>
     <w:p>
@@ -1492,81 +1265,25 @@
         <w:pStyle w:val="Heading2"/>
       </w:pPr>
       <w:r>
-        <w:t>The difference in validation</w:t>
+        <w:t>Validation, and where we sit</w:t>
       </w:r>
     </w:p>
     <w:p>
       <w:pPr>
-        <w:spacing w:after="140"/>
+        <w:spacing w:after="80"/>
       </w:pPr>
       <w:r>
         <w:rPr>
           <w:b w:val="0"/>
           <w:i w:val="0"/>
-          <w:sz w:val="22"/>
+          <w:sz w:val="20"/>
         </w:rPr>
-        <w:t>They validate empirically through field trials on four terrain types, which is the gold standard and requires built hardware. We validate formally, offline, through automated assertions that need nothing but a laptop. The two approaches are complementary rather than competing. Our approach caught a stance sign error that field testing would most likely have dismissed as a robot that simply needed tuning, because a robot walking badly and a robot with a reversed stance look similar on grass.</w:t>
-      </w:r>
-    </w:p>
-    <w:p>
-      <w:pPr>
-        <w:pStyle w:val="Heading2"/>
-      </w:pPr>
-      <w:r>
-        <w:t>Where our project sits relative to the paper</w:t>
-      </w:r>
-    </w:p>
-    <w:p>
-      <w:pPr>
-        <w:spacing w:after="140"/>
-      </w:pPr>
-      <w:r>
-        <w:rPr>
-          <w:b w:val="0"/>
-          <w:i w:val="0"/>
-          <w:sz w:val="22"/>
-        </w:rPr>
-        <w:t>They have a built robot with completed field trials. We have a complete simulation with verified mathematics, and hardware as the next phase. Their sensing package, an IMU and a force sensor on each foot, is essentially our next-phase list. Their adjustable clearance is a natural extension of our formulation, because our step height is already a parameter of the swing equation, so implementing their idea means scheduling that parameter against terrain rather than restructuring the gait.</w:t>
-      </w:r>
-    </w:p>
-    <w:p>
-      <w:pPr>
-        <w:pStyle w:val="Heading2"/>
-      </w:pPr>
-      <w:r>
-        <w:t>What we would adopt from the paper</w:t>
-      </w:r>
-    </w:p>
-    <w:p>
-      <w:pPr>
-        <w:pStyle w:val="ListBullet"/>
-        <w:spacing w:after="60"/>
-      </w:pPr>
-      <w:r>
-        <w:t>Cost of transport as an efficiency metric. We currently have no energy measure at all, and it is the standard figure for comparing legged robots.</w:t>
-      </w:r>
-    </w:p>
-    <w:p>
-      <w:pPr>
-        <w:pStyle w:val="ListBullet"/>
-        <w:spacing w:after="60"/>
-      </w:pPr>
-      <w:r>
-        <w:t>Adding the IMU earlier, for attitude feedback and body levelling. Our architecture has the place for it and we have not yet filled it.</w:t>
-      </w:r>
-    </w:p>
-    <w:p>
-      <w:pPr>
-        <w:pStyle w:val="ListBullet"/>
-        <w:spacing w:after="60"/>
-      </w:pPr>
-      <w:r>
-        <w:t>Reconsidering the leg structure. We print everything in PLA, whereas they use CNC aluminium for stressed parts, which is part of how they achieve an 8 kg payload. Our ANSYS results should decide whether that matters at our scale.</w:t>
+        <w:t>They validate empirically through field trials, which requires built hardware; we validate formally offline through automated assertions. The approaches are complementary, and ours caught a stance sign error that field testing would probably have dismissed as a robot needing tuning. They have a built robot with completed trials, while we have a complete simulation with verified mathematics and hardware as the next phase. Their sensing package is essentially our next-phase list, and their adjustable clearance is a natural extension of our formulation, since our step height is already a parameter of the swing equation.</w:t>
       </w:r>
     </w:p>
     <w:sectPr>
       <w:pgSz w:w="12240" w:h="15840"/>
-      <w:pgMar w:top="1224" w:right="1368" w:bottom="1224" w:left="1368" w:header="720" w:footer="720" w:gutter="0"/>
+      <w:pgMar w:top="792" w:right="1008" w:bottom="792" w:left="1008" w:header="720" w:footer="720" w:gutter="0"/>
       <w:cols w:space="720"/>
       <w:docGrid w:linePitch="360"/>
     </w:sectPr>
@@ -1938,11 +1655,11 @@
     <w:qFormat/>
     <w:rsid w:val="00FC693F"/>
     <w:pPr>
-      <w:spacing w:after="140" w:line="276" w:lineRule="auto"/>
+      <w:spacing w:after="80" w:line="254" w:lineRule="auto"/>
     </w:pPr>
     <w:rPr>
       <w:rFonts w:ascii="Calibri" w:hAnsi="Calibri"/>
-      <w:sz w:val="22"/>
+      <w:sz w:val="20"/>
     </w:rPr>
   </w:style>
   <w:style w:type="paragraph" w:styleId="Header">
@@ -2000,7 +1717,7 @@
     <w:pPr>
       <w:keepNext/>
       <w:keepLines/>
-      <w:spacing w:before="300" w:after="140"/>
+      <w:spacing w:before="140" w:after="60"/>
       <w:outlineLvl w:val="0"/>
     </w:pPr>
     <w:rPr>
@@ -2008,7 +1725,7 @@
       <w:b/>
       <w:bCs/>
       <w:color w:val="1F1F1F"/>
-      <w:sz w:val="29"/>
+      <w:sz w:val="24"/>
       <w:szCs w:val="28"/>
     </w:rPr>
   </w:style>
@@ -2024,7 +1741,7 @@
     <w:pPr>
       <w:keepNext/>
       <w:keepLines/>
-      <w:spacing w:before="220" w:after="100"/>
+      <w:spacing w:before="100" w:after="60"/>
       <w:outlineLvl w:val="1"/>
     </w:pPr>
     <w:rPr>
@@ -2032,7 +1749,7 @@
       <w:b/>
       <w:bCs/>
       <w:color w:val="1F1F1F"/>
-      <w:sz w:val="24"/>
+      <w:sz w:val="21"/>
       <w:szCs w:val="26"/>
     </w:rPr>
   </w:style>

</xml_diff>